<commit_message>
Poner al día los papeles de entrega con el sistema de hoy
El documento técnico dice dónde vive el sistema desde la migración a la
cuenta del restaurante, cómo se publica un cambio y cuatro pendientes nuevos:
el plan de Railway, los respaldos en la cuenta nueva, las fotos en un
Cloudinary propio y el cambio de las claves de primer acceso. El manual del
administrador explica las fotos de cada plato, la galería del local y cómo
cambiar una clave. La guía y el acta apuntan a www y avisan que las claves se
entregan aparte.

Las claves no van aquí: el repositorio es público. Se entregan en un
documento confidencial que no se versiona, y por lo mismo el correo de la
cuenta de Railway tampoco aparece en el documento técnico.

Co-Authored-By: Claude Opus 5.5 <noreply@anthropic.com>
</commit_message>
<xml_diff>
--- a/entrega/Acta de entrega - Sistema El Patio.docx
+++ b/entrega/Acta de entrega - Sistema El Patio.docx
@@ -212,7 +212,7 @@
               <w:rPr>
                 <w:sz w:val="20"/>
               </w:rPr>
-              <w:t>https://restauranteelpatio.com</w:t>
+              <w:t>https://www.restauranteelpatio.com</w:t>
             </w:r>
           </w:p>
         </w:tc>
@@ -257,7 +257,7 @@
         <w:t>Sitio público.</w:t>
       </w:r>
       <w:r>
-        <w:t xml:space="preserve"> Carta con fotos y precios, reservas, pedidos a domicilio y para llevar, «Trabaja con nosotros», PQR y política de datos. En https://restauranteelpatio.com.</w:t>
+        <w:t xml:space="preserve"> Carta con fotos y precios, reservas, pedidos a domicilio y para llevar, «Trabaja con nosotros», PQR y política de datos. En https://www.restauranteelpatio.com.</w:t>
       </w:r>
     </w:p>
     <w:p>
@@ -362,7 +362,7 @@
         <w:t>Documentación.</w:t>
       </w:r>
       <w:r>
-        <w:t xml:space="preserve"> Manuales de uso por rol, manual del administrador, guía del primer día y documento técnico de entrega.</w:t>
+        <w:t xml:space="preserve"> Manuales de uso por rol, manual del administrador, guía del primer día y documento técnico de entrega. Las contraseñas de primer acceso se entregan aparte, en un documento confidencial.</w:t>
       </w:r>
     </w:p>
     <w:p>
@@ -420,7 +420,7 @@
         <w:t>Base de datos.</w:t>
       </w:r>
       <w:r>
-        <w:t xml:space="preserve"> PostgreSQL en servidor administrado, con respaldos automáticos.</w:t>
+        <w:t xml:space="preserve"> PostgreSQL en servidor administrado. Los respaldos automáticos quedan pendientes de configurar en la cuenta del restaurante (sección 5).</w:t>
       </w:r>
     </w:p>
     <w:p>
@@ -1198,6 +1198,36 @@
     </w:p>
     <w:p>
       <w:pPr>
+        <w:pStyle w:val="ListBullet"/>
+        <w:spacing w:after="80"/>
+      </w:pPr>
+      <w:r>
+        <w:rPr>
+          <w:b/>
+        </w:rPr>
+        <w:t>Plan de Railway y respaldos.</w:t>
+      </w:r>
+      <w:r>
+        <w:t xml:space="preserve"> Activar el plan pago de Railway y configurar en esa cuenta el respaldo diario de la base de datos.</w:t>
+      </w:r>
+    </w:p>
+    <w:p>
+      <w:pPr>
+        <w:pStyle w:val="ListBullet"/>
+        <w:spacing w:after="80"/>
+      </w:pPr>
+      <w:r>
+        <w:rPr>
+          <w:b/>
+        </w:rPr>
+        <w:t>Fotos en cuenta propia.</w:t>
+      </w:r>
+      <w:r>
+        <w:t xml:space="preserve"> Pasar las fotos de los platos a una cuenta de Cloudinary a nombre del restaurante.</w:t>
+      </w:r>
+    </w:p>
+    <w:p>
+      <w:pPr>
         <w:spacing w:before="280" w:after="80"/>
       </w:pPr>
       <w:r>
@@ -1283,7 +1313,6 @@
             <w:tcW w:type="dxa" w:w="4759"/>
           </w:tcPr>
           <w:p>
-            <w:r/>
             <w:r>
               <w:br/>
               <w:br/>
@@ -1296,7 +1325,6 @@
             <w:tcW w:type="dxa" w:w="4759"/>
           </w:tcPr>
           <w:p>
-            <w:r/>
             <w:r>
               <w:br/>
               <w:br/>

</xml_diff>

<commit_message>
Documentos de entrega al día con los cambios del 12 de octubre
- Acta y documento técnico parten de la versión del 10 oct que estaba en la USB.
- Cocina: cronómetro contra el tiempo estimado de cada plato, cambiar el tiempo
  desde la tarjeta, nombre del mesero; lo entregado sale solo.
- Mesero y cajero: botón «Entregado» por plato, «Todo entregado» a la vista,
  reloj grande por turno y columna «Cocina» en Caja.
- Administrador: tiempo estimado, recomendados, más pedidos, hojas de vida por
  correo; sale la conciliación, que se quitó del panel.
- Técnico y acta: correo por la API de Zoho, política de datos editable (ya no
  es borrador), Railway en prueba apaga el sistema, fotos de los platos pendientes
  (el restaurante las envía la semana del 12 oct).

Co-Authored-By: Claude Opus 5.5 <noreply@anthropic.com>
</commit_message>
<xml_diff>
--- a/entrega/Acta de entrega - Sistema El Patio.docx
+++ b/entrega/Acta de entrega - Sistema El Patio.docx
@@ -257,7 +257,8 @@
         <w:t>Sitio público.</w:t>
       </w:r>
       <w:r>
-        <w:t xml:space="preserve"> Carta con fotos y precios, reservas, pedidos a domicilio y para llevar, «Trabaja con nosotros», PQR y política de datos. En https://www.restauranteelpatio.com.</w:t>
+        <w:rPr/>
+        <w:t xml:space="preserve"> Carta con fotos y precios, recomendados de la casa y los más pedidos, reservas, pedidos a domicilio y para llevar, «Trabaja con nosotros» con aviso por correo a recursos humanos, PQR y política de datos. En https://www.restauranteelpatio.com.</w:t>
       </w:r>
     </w:p>
     <w:p>
@@ -272,7 +273,8 @@
         <w:t>Comandera de salón.</w:t>
       </w:r>
       <w:r>
-        <w:t xml:space="preserve"> Mapa de mesas, apertura de cuenta, toma de comanda con modificadores, traslado de cuenta, cargos adicionales y anulación con motivo.</w:t>
+        <w:rPr/>
+        <w:t xml:space="preserve"> Mapa de mesas, apertura de cuenta, toma de comanda con modificadores, traslado de cuenta, cargos adicionales y anulación con motivo. Cada turno muestra cuánto falta contra el tiempo estimado, y cada plato tiene el botón «Entregado» para sacarlo de cocina.</w:t>
       </w:r>
     </w:p>
     <w:p>
@@ -287,7 +289,8 @@
         <w:t>Pantalla de cocina y de barra.</w:t>
       </w:r>
       <w:r>
-        <w:t xml:space="preserve"> Cada producto cae en su puesto de trabajo. Cronómetro por comanda y aviso sonoro.</w:t>
+        <w:rPr/>
+        <w:t xml:space="preserve"> Cada producto cae en su puesto de trabajo. Cronómetro por comanda contra el tiempo estimado de sus platos, que el cocinero puede ajustar, nombre del mesero y aviso sonoro.</w:t>
       </w:r>
     </w:p>
     <w:p>
@@ -332,7 +335,8 @@
         <w:t>Caja.</w:t>
       </w:r>
       <w:r>
-        <w:t xml:space="preserve"> Cobro con pago mixto, división de cuenta, propina consultada, comprobante térmico y cierre de turno.</w:t>
+        <w:rPr/>
+        <w:t xml:space="preserve"> Cobro con pago mixto, división de cuenta, propina consultada, comprobante térmico y cierre de turno. Desde Caja también se marcan los platos entregados.</w:t>
       </w:r>
     </w:p>
     <w:p>
@@ -347,7 +351,24 @@
         <w:t>Panel administrativo.</w:t>
       </w:r>
       <w:r>
-        <w:t xml:space="preserve"> Carta y precios, publicaciones, usuarios, mesas, zonas de domicilio, horario y contacto del sitio, reportes, conciliación contable, PQR y postulaciones.</w:t>
+        <w:rPr/>
+        <w:t xml:space="preserve"> Carta y precios con tiempo estimado por plato y recomendados de la casa, publicaciones, usuarios, mesas, zonas de domicilio, horario y contacto del sitio, política de datos, reportes, PQR y postulaciones.</w:t>
+      </w:r>
+    </w:p>
+    <w:p>
+      <w:pPr>
+        <w:pStyle w:val="ListBullet"/>
+        <w:spacing w:after="80"/>
+      </w:pPr>
+      <w:r>
+        <w:rPr>
+          <w:b/>
+        </w:rPr>
+        <w:t>Correos corporativos.</w:t>
+      </w:r>
+      <w:r>
+        <w:rPr/>
+        <w:t xml:space="preserve"> Siete buzones en Zoho Mail con el dominio del restaurante: administrador, compras, contabilidad, auxiliar contable, facturas, recursos humanos y reservas. Desde recursos humanos el sistema envía los avisos de hojas de vida y PQR. Las claves se entregan en el documento confidencial.</w:t>
       </w:r>
     </w:p>
     <w:p>
@@ -435,7 +456,8 @@
         <w:t>Carta cargada.</w:t>
       </w:r>
       <w:r>
-        <w:t xml:space="preserve"> La carta 2026 del restaurante quedó cargada con sus categorías y precios.</w:t>
+        <w:rPr/>
+        <w:t xml:space="preserve"> La carta 2026 del restaurante quedó cargada con sus categorías y precios. Las fotos de los platos se cargan cuando el restaurante las entregue (sección 5).</w:t>
       </w:r>
     </w:p>
     <w:p>
@@ -1055,12 +1077,8 @@
             <w:tcW w:type="dxa" w:w="2835"/>
           </w:tcPr>
           <w:p>
-            <w:r/>
             <w:r>
-              <w:rPr>
-                <w:sz w:val="20"/>
-              </w:rPr>
-              <w:t>Correo del restaurante</w:t>
+              <w:t>Correo del restaurante (Zoho Mail)</w:t>
             </w:r>
           </w:p>
         </w:tc>
@@ -1069,12 +1087,8 @@
             <w:tcW w:type="dxa" w:w="3685"/>
           </w:tcPr>
           <w:p>
-            <w:r/>
             <w:r>
-              <w:rPr>
-                <w:sz w:val="20"/>
-              </w:rPr>
-              <w:t>Avisos del sistema</w:t>
+              <w:t>Los buzones @restauranteelpatio.com y los avisos del sistema</w:t>
             </w:r>
           </w:p>
         </w:tc>
@@ -1148,7 +1162,8 @@
         <w:t>Política de tratamiento de datos.</w:t>
       </w:r>
       <w:r>
-        <w:t xml:space="preserve"> La publicada es un borrador y lo dice en la propia página. El restaurante debe reemplazarla por la suya, revisada por su abogado, porque el formulario de hojas de vida recoge datos personales.</w:t>
+        <w:rPr/>
+        <w:t xml:space="preserve"> Publicada y editable desde el panel, en Institucional. Conviene que la revise el abogado del restaurante, porque el formulario de hojas de vida recoge datos personales.</w:t>
       </w:r>
     </w:p>
     <w:p>
@@ -1208,7 +1223,24 @@
         <w:t>Plan de Railway y respaldos.</w:t>
       </w:r>
       <w:r>
-        <w:t xml:space="preserve"> Activar el plan pago de Railway y configurar en esa cuenta el respaldo diario de la base de datos.</w:t>
+        <w:rPr/>
+        <w:t xml:space="preserve"> Activar el plan pago de Railway y configurar en esa cuenta el respaldo diario de la base de datos. Mientras siga en prueba, al acabarse el crédito Railway apaga el sistema.</w:t>
+      </w:r>
+    </w:p>
+    <w:p>
+      <w:pPr>
+        <w:pStyle w:val="ListBullet"/>
+        <w:spacing w:after="80"/>
+      </w:pPr>
+      <w:r>
+        <w:rPr>
+          <w:b/>
+        </w:rPr>
+        <w:t>Fotos de la carta.</w:t>
+      </w:r>
+      <w:r>
+        <w:rPr/>
+        <w:t xml:space="preserve"> Entregar las fotos de los platos, como quedó acordado para la semana del 12 de octubre de 2026. Es lo único que falta para que la carta del sitio quede completa.</w:t>
       </w:r>
     </w:p>
     <w:p>

</xml_diff>

<commit_message>
Documentos de entrega: aviso de reservas por correo y sistema sin datos de prueba
- Recepción y administrador: cada reserva del sitio llega a reservas@ con
  enlace para confirmar por WhatsApp; se confirma en el panel.
- Técnico: el buzón de reservas con su Self Client y sus variables.
- Acta: reservas con aviso por correo, quién envía desde cada buzón y «sin
  datos de prueba» en el estado de la entrega.

Co-Authored-By: Claude Opus 5.5 <noreply@anthropic.com>
Claude-Session: https://claude.ai/code/session_013rPUQau1PfLvciQ2zKDNKc
</commit_message>
<xml_diff>
--- a/entrega/Acta de entrega - Sistema El Patio.docx
+++ b/entrega/Acta de entrega - Sistema El Patio.docx
@@ -258,7 +258,7 @@
       </w:r>
       <w:r>
         <w:rPr/>
-        <w:t xml:space="preserve"> Carta con fotos y precios, recomendados de la casa y los más pedidos, reservas, pedidos a domicilio y para llevar, «Trabaja con nosotros» con aviso por correo a recursos humanos, PQR y política de datos. En https://www.restauranteelpatio.com.</w:t>
+        <w:t xml:space="preserve"> Carta con fotos y precios, recomendados de la casa y los más pedidos, reservas con aviso por correo al buzón de reservas, pedidos a domicilio y para llevar, «Trabaja con nosotros» con aviso por correo a recursos humanos, PQR y política de datos. En https://www.restauranteelpatio.com.</w:t>
       </w:r>
     </w:p>
     <w:p>
@@ -368,7 +368,7 @@
       </w:r>
       <w:r>
         <w:rPr/>
-        <w:t xml:space="preserve"> Siete buzones en Zoho Mail con el dominio del restaurante: administrador, compras, contabilidad, auxiliar contable, facturas, recursos humanos y reservas. Desde recursos humanos el sistema envía los avisos de hojas de vida y PQR. Las claves se entregan en el documento confidencial.</w:t>
+        <w:t xml:space="preserve"> Siete buzones en Zoho Mail con el dominio del restaurante: administrador, compras, contabilidad, auxiliar contable, facturas, recursos humanos y reservas. El sistema envía desde recursos humanos los avisos de hojas de vida y PQR, y desde reservas los de reservas. Las claves se entregan en el documento confidencial.</w:t>
       </w:r>
     </w:p>
     <w:p>
@@ -473,6 +473,22 @@
       </w:r>
       <w:r>
         <w:t xml:space="preserve"> Una cuenta por persona, con su rol. Las claves se entregan aparte y deben cambiarse en el primer ingreso.</w:t>
+      </w:r>
+    </w:p>
+    <w:p>
+      <w:pPr>
+        <w:pStyle w:val="ListBullet"/>
+        <w:spacing w:after="80"/>
+      </w:pPr>
+      <w:r>
+        <w:rPr>
+          <w:b/>
+        </w:rPr>
+        <w:t>Sin datos de prueba.</w:t>
+      </w:r>
+      <w:r>
+        <w:rPr/>
+        <w:t xml:space="preserve"> El sistema se entrega en cero: sin ventas, comandas, reservas, hojas de vida ni PQR de las pruebas. La carta, las mesas, el personal y la configuración quedan cargados.</w:t>
       </w:r>
     </w:p>
     <w:p>

</xml_diff>